<commit_message>
still modifying summary section
</commit_message>
<xml_diff>
--- a/Kevin_Xu_Resume.docx
+++ b/Kevin_Xu_Resume.docx
@@ -31,7 +31,7 @@
           <w:sz w:val="22"/>
           <w:szCs w:val="22"/>
         </w:rPr>
-        <w:t xml:space="preserve">Software Engineer  ·  Mobile &amp; Full-Stack Developer</w:t>
+        <w:t xml:space="preserve">Software Engineer  ·  Full-Stack Developer</w:t>
       </w:r>
     </w:p>
     <w:p>
@@ -55,7 +55,7 @@
         </w:rPr>
         <w:t xml:space="preserve">321-332-5472  ·  </w:t>
       </w:r>
-      <w:hyperlink w:history="1" r:id="rIdync-v2cs14bo9vsdveee0">
+      <w:hyperlink w:history="1" r:id="rIdulnnwaeyybvmkyoyehtzh">
         <w:r>
           <w:rPr>
             <w:rFonts w:ascii="Calibri" w:cs="Calibri" w:eastAsia="Calibri" w:hAnsi="Calibri"/>
@@ -86,7 +86,7 @@
         </w:rPr>
         <w:t xml:space="preserve">Portfolio: </w:t>
       </w:r>
-      <w:hyperlink w:history="1" r:id="rIdpgvn7sinsh805ad6zylpz">
+      <w:hyperlink w:history="1" r:id="rIdbbhjjuelqktdln4cwkfj0">
         <w:r>
           <w:rPr>
             <w:rFonts w:ascii="Calibri" w:cs="Calibri" w:eastAsia="Calibri" w:hAnsi="Calibri"/>
@@ -104,7 +104,7 @@
         <w:spacing w:after="80"/>
         <w:jc w:val="center"/>
       </w:pPr>
-      <w:hyperlink w:history="1" r:id="rId1eahvphsd3oivwhloyk_n">
+      <w:hyperlink w:history="1" r:id="rId6env8hb4sl4-8_ornzpvk">
         <w:r>
           <w:rPr>
             <w:rFonts w:ascii="Calibri" w:cs="Calibri" w:eastAsia="Calibri" w:hAnsi="Calibri"/>
@@ -124,7 +124,7 @@
         </w:rPr>
         <w:t xml:space="preserve">  ·  </w:t>
       </w:r>
-      <w:hyperlink w:history="1" r:id="rIdmxaahonteggkv97xq2ilu">
+      <w:hyperlink w:history="1" r:id="rIdkmvnckiru7ljb9bqrmygo">
         <w:r>
           <w:rPr>
             <w:rFonts w:ascii="Calibri" w:cs="Calibri" w:eastAsia="Calibri" w:hAnsi="Calibri"/>
@@ -167,7 +167,7 @@
           <w:sz w:val="20"/>
           <w:szCs w:val="20"/>
         </w:rPr>
-        <w:t xml:space="preserve">Software engineer with a B.S. in Computer Science from UCF and hands-on experience across mobile, frontend, and full-stack development. Skilled in React Native, Flutter, ReactJS, and Node.js — converting Figma designs into production-ready interfaces, integrating REST APIs, and shipping end-to-end features. Currently maintaining ERP data integrity at a pharmaceutical company while independently architecting SenYu, a C2C marketplace mobile app.</w:t>
+        <w:t xml:space="preserve">Software engineer with a B.S. in Computer Science from UCF and hands-on experience in full-stack web development. Skilled in ReactJS, Node.js, Express, and MongoDB — converting Figma designs into production-ready interfaces, integrating REST APIs, and shipping end-to-end features. Currently maintaining ERP data integrity at a pharmaceutical company while independently architecting SenYu, a C2C marketplace website.</w:t>
       </w:r>
     </w:p>
     <w:p>
@@ -253,7 +253,7 @@
           <w:sz w:val="20"/>
           <w:szCs w:val="20"/>
         </w:rPr>
-        <w:t xml:space="preserve">React Native, Flutter, ReactJS, Node.js, Express, Expo</w:t>
+        <w:t xml:space="preserve">ReactJS, Node.js, Express, React Native, Flutter, Expo</w:t>
       </w:r>
     </w:p>
     <w:p>
@@ -412,9 +412,9 @@
           <w:sz w:val="20"/>
           <w:szCs w:val="20"/>
         </w:rPr>
-        <w:t xml:space="preserve">React Native · Expo · MongoDB Atlas · Node.js  ·  </w:t>
-      </w:r>
-      <w:hyperlink w:history="1" r:id="rIdoz5zmvkxlhgehjkz8ismc">
+        <w:t xml:space="preserve">React · Node.js · Express · MongoDB · Stripe · Socket.IO · Claude AI  ·  </w:t>
+      </w:r>
+      <w:hyperlink w:history="1" r:id="rIdoq0l7hhyswzbhs0uis_kx">
         <w:r>
           <w:rPr>
             <w:rFonts w:ascii="Calibri" w:cs="Calibri" w:eastAsia="Calibri" w:hAnsi="Calibri"/>
@@ -442,7 +442,7 @@
           <w:sz w:val="20"/>
           <w:szCs w:val="20"/>
         </w:rPr>
-        <w:t xml:space="preserve">Architecting a cross-platform C2C marketplace for premium secondhand badminton equipment from scratch — full product ownership from concept to launch roadmap.</w:t>
+        <w:t xml:space="preserve">Architecting a C2C marketplace website for premium secondhand badminton equipment from scratch — full product ownership from concept to launch roadmap.</w:t>
       </w:r>
     </w:p>
     <w:p>
@@ -460,7 +460,7 @@
           <w:sz w:val="20"/>
           <w:szCs w:val="20"/>
         </w:rPr>
-        <w:t xml:space="preserve">Designed database schemas, real-time listings, user authentication, and a mobile-first UI tuned for serious players.</w:t>
+        <w:t xml:space="preserve">Designed database schemas, real-time listings, user authentication, and a responsive UI tuned for serious players.</w:t>
       </w:r>
     </w:p>
     <w:p>
@@ -535,7 +535,7 @@
         </w:rPr>
         <w:t xml:space="preserve">Shopify · Liquid · HTML5 · CSS3 · JavaScript  ·  </w:t>
       </w:r>
-      <w:hyperlink w:history="1" r:id="rIdhteai8dl7muhgxzxzaw1i">
+      <w:hyperlink w:history="1" r:id="rId9bp5xb9ejaod-8ku2bfgm">
         <w:r>
           <w:rPr>
             <w:rFonts w:ascii="Calibri" w:cs="Calibri" w:eastAsia="Calibri" w:hAnsi="Calibri"/>
@@ -581,7 +581,7 @@
           <w:sz w:val="20"/>
           <w:szCs w:val="20"/>
         </w:rPr>
-        <w:t xml:space="preserve">Hand-wrote every Liquid template and self-designed the page layouts from scratch — no third-party themes or apps.</w:t>
+        <w:t xml:space="preserve">Self-designed every page layout and shipped fully custom Liquid templates — no third-party themes or apps.</w:t>
       </w:r>
     </w:p>
     <w:p>
@@ -656,7 +656,7 @@
         </w:rPr>
         <w:t xml:space="preserve">Flutter · Firebase · Google Maps API  ·  </w:t>
       </w:r>
-      <w:hyperlink w:history="1" r:id="rIdojt9eiifamep5yrizawl8">
+      <w:hyperlink w:history="1" r:id="rIdkwdcc7fjm7zli4qze69sw">
         <w:r>
           <w:rPr>
             <w:rFonts w:ascii="Calibri" w:cs="Calibri" w:eastAsia="Calibri" w:hAnsi="Calibri"/>
@@ -795,7 +795,7 @@
         </w:rPr>
         <w:t xml:space="preserve">ReactJS · Node.js · Google Maps API  ·  </w:t>
       </w:r>
-      <w:hyperlink w:history="1" r:id="rIdzq85xn13w55ka6q8zewak">
+      <w:hyperlink w:history="1" r:id="rId-3hi0mki9guwodfvbwgbu">
         <w:r>
           <w:rPr>
             <w:rFonts w:ascii="Calibri" w:cs="Calibri" w:eastAsia="Calibri" w:hAnsi="Calibri"/>
@@ -916,7 +916,7 @@
         </w:rPr>
         <w:t xml:space="preserve">HTML5 · CSS3 · JavaScript  ·  </w:t>
       </w:r>
-      <w:hyperlink w:history="1" r:id="rIdqucwzovtapzkf9ahaz397">
+      <w:hyperlink w:history="1" r:id="rId273aohxveahalbuw4btpx">
         <w:r>
           <w:rPr>
             <w:rFonts w:ascii="Calibri" w:cs="Calibri" w:eastAsia="Calibri" w:hAnsi="Calibri"/>
@@ -962,7 +962,7 @@
           <w:sz w:val="20"/>
           <w:szCs w:val="20"/>
         </w:rPr>
-        <w:t xml:space="preserve">Implemented form validation and collaborated with backend team for data integration.</w:t>
+        <w:t xml:space="preserve">Wrote JavaScript form validation; integrated with team-built backend via HTML form actions.</w:t>
       </w:r>
     </w:p>
     <w:p>
@@ -1063,7 +1063,7 @@
           <w:sz w:val="20"/>
           <w:szCs w:val="20"/>
         </w:rPr>
-        <w:t xml:space="preserve">Designed and shipped the company corporate website (3h.life) on Shopify, hand-writing all custom Liquid templates from scratch.</w:t>
+        <w:t xml:space="preserve">Designed and shipped the company corporate website (3h.life) on Shopify, building every page with custom Liquid templates.</w:t>
       </w:r>
     </w:p>
     <w:p>

</xml_diff>